<commit_message>
preview: deploy pr-11 from 514c4b9d93c1fe6d48609eb73a193872f701b243 a3a3af548092485ca6454e4385bb1cfaedbf3302
</commit_message>
<xml_diff>
--- a/pr-11/KRISH_PAVULURI_CV.docx
+++ b/pr-11/KRISH_PAVULURI_CV.docx
@@ -44,7 +44,7 @@
         </w:rPr>
         <w:t xml:space="preserve">Montreal, QC  |  438-928-0928  |  </w:t>
       </w:r>
-      <w:hyperlink w:history="1" r:id="rIdmeorlk9tcrw5k_xa8ln9a">
+      <w:hyperlink w:history="1" r:id="rIdlfjig2wsp0q749etfcqnm">
         <w:r>
           <w:rPr>
             <w:rStyle w:val="Hyperlink"/>
@@ -61,7 +61,7 @@
         </w:rPr>
         <w:t xml:space="preserve">  |  </w:t>
       </w:r>
-      <w:hyperlink w:history="1" r:id="rIdxhomlugkwiclz9fviqubr">
+      <w:hyperlink w:history="1" r:id="rIddsuooa1msqhc-yp0eh8dq">
         <w:r>
           <w:rPr>
             <w:rStyle w:val="Hyperlink"/>
@@ -78,7 +78,7 @@
         </w:rPr>
         <w:t xml:space="preserve">  |  </w:t>
       </w:r>
-      <w:hyperlink w:history="1" r:id="rIdzgxc5iwnorqn0sidtsdrz">
+      <w:hyperlink w:history="1" r:id="rId8ptnhm14mweytp138mdt_">
         <w:r>
           <w:rPr>
             <w:rStyle w:val="Hyperlink"/>

</xml_diff>